<commit_message>
docs: package verified contest evidence
</commit_message>
<xml_diff>
--- a/submission/2026 오픈소스 개발자대회 결과보고서_접수번호(팀명)_DRAFT.docx
+++ b/submission/2026 오픈소스 개발자대회 결과보고서_접수번호(팀명)_DRAFT.docx
@@ -864,17 +864,16 @@
           </w:tcPr>
           <w:p>
             <w:pPr>
-              <w:spacing w:before="0" w:after="40" w:line="240" w:lineRule="auto"/>
-              <w:jc w:val="left"/>
-            </w:pPr>
-            <w:r>
-              <w:rPr>
-                <w:rFonts w:ascii="맑은 고딕" w:hAnsi="맑은 고딕" w:eastAsia="맑은 고딕"/>
-                <w:b w:val="0"/>
-                <w:color w:val="000000"/>
+              <w:spacing w:before="0" w:after="0" w:line="240" w:lineRule="auto"/>
+              <w:jc w:val="left"/>
+            </w:pPr>
+            <w:r>
+              <w:rPr>
+                <w:rFonts w:ascii="맑은 고딕" w:hAnsi="맑은 고딕" w:eastAsia="맑은 고딕"/>
+                <w:b w:val="0"/>
                 <w:sz w:val="20"/>
               </w:rPr>
-              <w:t>https://github.com/Junghoo-developer/SongRyeon/tree/refoundation/songryeon-v1</w:t>
+              <w:t>https://github.com/Junghoo-developer/SongRyeon/tree/codex/contest-release-2026</w:t>
             </w:r>
           </w:p>
         </w:tc>
@@ -1261,92 +1260,86 @@
           </w:tcPr>
           <w:p>
             <w:pPr>
-              <w:spacing w:before="0" w:after="40" w:line="240" w:lineRule="auto"/>
-              <w:jc w:val="left"/>
-            </w:pPr>
-            <w:r>
-              <w:rPr>
-                <w:rFonts w:ascii="맑은 고딕" w:hAnsi="맑은 고딕" w:eastAsia="맑은 고딕"/>
-                <w:b/>
-                <w:color w:val="000000"/>
-                <w:sz w:val="20"/>
+              <w:spacing w:before="0" w:after="0" w:line="240" w:lineRule="auto"/>
+              <w:jc w:val="left"/>
+            </w:pPr>
+            <w:r>
+              <w:rPr>
+                <w:rFonts w:ascii="맑은 고딕" w:hAnsi="맑은 고딕" w:eastAsia="맑은 고딕"/>
+                <w:b/>
+                <w:sz w:val="19"/>
               </w:rPr>
               <w:t>언어·저장</w:t>
             </w:r>
           </w:p>
           <w:p>
             <w:pPr>
-              <w:spacing w:before="0" w:after="40" w:line="240" w:lineRule="auto"/>
-              <w:jc w:val="left"/>
-            </w:pPr>
-            <w:r>
-              <w:rPr>
-                <w:rFonts w:ascii="맑은 고딕" w:hAnsi="맑은 고딕" w:eastAsia="맑은 고딕"/>
-                <w:b w:val="0"/>
-                <w:color w:val="000000"/>
-                <w:sz w:val="20"/>
-              </w:rPr>
-              <w:t>Python 3.10 이상, UTF-8 JSONL 원본 기억, SQLite 지식 색인. 필수 Python 런타임 의존성 없이 표준 라이브러리로 구성했다.</w:t>
-            </w:r>
-          </w:p>
-          <w:p>
-            <w:pPr>
-              <w:spacing w:before="0" w:after="40" w:line="240" w:lineRule="auto"/>
-              <w:jc w:val="left"/>
-            </w:pPr>
-            <w:r>
-              <w:rPr>
-                <w:rFonts w:ascii="맑은 고딕" w:hAnsi="맑은 고딕" w:eastAsia="맑은 고딕"/>
-                <w:b/>
-                <w:color w:val="000000"/>
-                <w:sz w:val="20"/>
+              <w:spacing w:before="0" w:after="20" w:line="240" w:lineRule="auto"/>
+              <w:jc w:val="left"/>
+            </w:pPr>
+            <w:r>
+              <w:rPr>
+                <w:rFonts w:ascii="맑은 고딕" w:hAnsi="맑은 고딕" w:eastAsia="맑은 고딕"/>
+                <w:b w:val="0"/>
+                <w:sz w:val="19"/>
+              </w:rPr>
+              <w:t>Python 3.10 이상, UTF-8 JSONL 원본 기억, SQLite 지식 색인. 실행부는 필수 외부 Python 패키지 없이 표준 라이브러리로 구성했다.</w:t>
+            </w:r>
+          </w:p>
+          <w:p>
+            <w:pPr>
+              <w:spacing w:before="40" w:after="0" w:line="240" w:lineRule="auto"/>
+              <w:jc w:val="left"/>
+            </w:pPr>
+            <w:r>
+              <w:rPr>
+                <w:rFonts w:ascii="맑은 고딕" w:hAnsi="맑은 고딕" w:eastAsia="맑은 고딕"/>
+                <w:b/>
+                <w:sz w:val="19"/>
               </w:rPr>
               <w:t>모델 실행</w:t>
             </w:r>
           </w:p>
           <w:p>
             <w:pPr>
-              <w:spacing w:before="0" w:after="40" w:line="240" w:lineRule="auto"/>
-              <w:jc w:val="left"/>
-            </w:pPr>
-            <w:r>
-              <w:rPr>
-                <w:rFonts w:ascii="맑은 고딕" w:hAnsi="맑은 고딕" w:eastAsia="맑은 고딕"/>
-                <w:b w:val="0"/>
-                <w:color w:val="000000"/>
-                <w:sz w:val="20"/>
-              </w:rPr>
-              <w:t>Ollama 0.32.5의 로컬 HTTP 인터페이스. 제출 프로필은 gemma4:26b(Q4_K_M, 요청 컨텍스트 16,384, temperature 0, seed 42), qwen3:14b는 비교 기준선이다.</w:t>
-            </w:r>
-          </w:p>
-          <w:p>
-            <w:pPr>
-              <w:spacing w:before="0" w:after="40" w:line="240" w:lineRule="auto"/>
-              <w:jc w:val="left"/>
-            </w:pPr>
-            <w:r>
-              <w:rPr>
-                <w:rFonts w:ascii="맑은 고딕" w:hAnsi="맑은 고딕" w:eastAsia="맑은 고딕"/>
-                <w:b/>
-                <w:color w:val="000000"/>
-                <w:sz w:val="20"/>
-              </w:rPr>
-              <w:t>검증 환경(2026-07-30 관찰값)</w:t>
-            </w:r>
-          </w:p>
-          <w:p>
-            <w:pPr>
-              <w:spacing w:before="0" w:after="40" w:line="240" w:lineRule="auto"/>
-              <w:jc w:val="left"/>
-            </w:pPr>
-            <w:r>
-              <w:rPr>
-                <w:rFonts w:ascii="맑은 고딕" w:hAnsi="맑은 고딕" w:eastAsia="맑은 고딕"/>
-                <w:b w:val="0"/>
-                <w:color w:val="000000"/>
-                <w:sz w:val="20"/>
-              </w:rPr>
-              <w:t>Windows 11 Pro 64-bit, Intel Core i9-14900K, NVIDIA GeForce RTX 5080 16,303 MiB, 물리 메모리 63.69 GiB, Python 3.10.11. 이는 최소 사양이 아니라 검증 호스트 기록이다.</w:t>
+              <w:spacing w:before="0" w:after="20" w:line="240" w:lineRule="auto"/>
+              <w:jc w:val="left"/>
+            </w:pPr>
+            <w:r>
+              <w:rPr>
+                <w:rFonts w:ascii="맑은 고딕" w:hAnsi="맑은 고딕" w:eastAsia="맑은 고딕"/>
+                <w:b w:val="0"/>
+                <w:sz w:val="19"/>
+              </w:rPr>
+              <w:t>Ollama 0.32.5의 로컬 HTTP 인터페이스. 제출 프로필은 gemma4:26b(Q4_K_M, 컨텍스트 16,384, temperature 0)이며, 공식 v2는 동일 모델의 Node2·Node4 없는 단일 에이전트·Node4 제외·전체 송련을 비교했다. seed는 1709, 2647, 3911이다.</w:t>
+            </w:r>
+          </w:p>
+          <w:p>
+            <w:pPr>
+              <w:spacing w:before="40" w:after="0" w:line="240" w:lineRule="auto"/>
+              <w:jc w:val="left"/>
+            </w:pPr>
+            <w:r>
+              <w:rPr>
+                <w:rFonts w:ascii="맑은 고딕" w:hAnsi="맑은 고딕" w:eastAsia="맑은 고딕"/>
+                <w:b/>
+                <w:sz w:val="19"/>
+              </w:rPr>
+              <w:t>검증 환경</w:t>
+            </w:r>
+          </w:p>
+          <w:p>
+            <w:pPr>
+              <w:spacing w:before="0" w:after="20" w:line="240" w:lineRule="auto"/>
+              <w:jc w:val="left"/>
+            </w:pPr>
+            <w:r>
+              <w:rPr>
+                <w:rFonts w:ascii="맑은 고딕" w:hAnsi="맑은 고딕" w:eastAsia="맑은 고딕"/>
+                <w:b w:val="0"/>
+                <w:sz w:val="19"/>
+              </w:rPr>
+              <w:t>Windows 11 Pro 64-bit, Intel Core i9-14900K, NVIDIA GeForce RTX 5080 16,303 MiB, 메모리 63.69 GiB, Python 3.10.11. 최소 사양이 아니라 2026-07-30에 관찰한 호스트 기록이다.</w:t>
             </w:r>
           </w:p>
         </w:tc>
@@ -1575,122 +1568,114 @@
           </w:tcPr>
           <w:p>
             <w:pPr>
-              <w:spacing w:before="0" w:after="40" w:line="240" w:lineRule="auto"/>
-              <w:jc w:val="left"/>
-            </w:pPr>
-            <w:r>
-              <w:rPr>
-                <w:rFonts w:ascii="맑은 고딕" w:hAnsi="맑은 고딕" w:eastAsia="맑은 고딕"/>
-                <w:b/>
-                <w:color w:val="000000"/>
-                <w:sz w:val="20"/>
+              <w:spacing w:before="0" w:after="0" w:line="240" w:lineRule="auto"/>
+              <w:jc w:val="left"/>
+            </w:pPr>
+            <w:r>
+              <w:rPr>
+                <w:rFonts w:ascii="맑은 고딕" w:hAnsi="맑은 고딕" w:eastAsia="맑은 고딕"/>
+                <w:b/>
+                <w:sz w:val="18"/>
               </w:rPr>
               <w:t>핵심 기능</w:t>
             </w:r>
           </w:p>
           <w:p>
             <w:pPr>
-              <w:spacing w:before="0" w:after="40" w:line="240" w:lineRule="auto"/>
-              <w:jc w:val="left"/>
-            </w:pPr>
-            <w:r>
-              <w:rPr>
-                <w:rFonts w:ascii="맑은 고딕" w:hAnsi="맑은 고딕" w:eastAsia="맑은 고딕"/>
-                <w:b w:val="0"/>
-                <w:color w:val="000000"/>
-                <w:sz w:val="20"/>
-              </w:rPr>
-              <w:t>1) append-only JSONL에 A/R 원자와 노드·도구 동선을 기록. 2) 모델이 보존 원문을 재작성하지 못하도록 코드가 정확한 구간을 복사. 3) 절대경로·상위경로 탈출·심볼릭 링크 이탈·비 Python 파일·크기 상한 초과를 파일 도구에서 거부. 4) Node2 증거 충분성 검사와 Node4 답변 근거 검열을 분리.</w:t>
-            </w:r>
-          </w:p>
-          <w:p>
-            <w:pPr>
-              <w:spacing w:before="0" w:after="40" w:line="240" w:lineRule="auto"/>
-              <w:jc w:val="left"/>
-            </w:pPr>
-            <w:r>
-              <w:rPr>
-                <w:rFonts w:ascii="맑은 고딕" w:hAnsi="맑은 고딕" w:eastAsia="맑은 고딕"/>
-                <w:b/>
-                <w:color w:val="000000"/>
-                <w:sz w:val="20"/>
-              </w:rPr>
-              <w:t>개발 과정</w:t>
-            </w:r>
-          </w:p>
-          <w:p>
-            <w:pPr>
-              <w:spacing w:before="0" w:after="40" w:line="240" w:lineRule="auto"/>
-              <w:jc w:val="left"/>
-            </w:pPr>
-            <w:r>
-              <w:rPr>
-                <w:rFonts w:ascii="맑은 고딕" w:hAnsi="맑은 고딕" w:eastAsia="맑은 고딕"/>
-                <w:b w:val="0"/>
-                <w:color w:val="000000"/>
-                <w:sz w:val="20"/>
-              </w:rPr>
-              <w:t>저장 레코드와 테스트 격리부터 시작해 에이전트 시야, 도구 원문 보존, 전부 omit 복구, 유한 반려 루프, 로컬 모델 JSON 호출 순으로 작은 모듈과 결정론적 테스트를 추가했다. 실제 데모에서 과거 요청 반복, 근거 없는 부재 주장, 원문 전부 omit 문제를 확인하고 프롬프트·라우팅·상태 표시를 보완했다.</w:t>
-            </w:r>
-          </w:p>
-          <w:p>
-            <w:pPr>
-              <w:spacing w:before="0" w:after="40" w:line="240" w:lineRule="auto"/>
-              <w:jc w:val="left"/>
-            </w:pPr>
-            <w:r>
-              <w:rPr>
-                <w:rFonts w:ascii="맑은 고딕" w:hAnsi="맑은 고딕" w:eastAsia="맑은 고딕"/>
-                <w:b/>
-                <w:color w:val="000000"/>
-                <w:sz w:val="20"/>
-              </w:rPr>
-              <w:t>구동·시험</w:t>
-            </w:r>
-          </w:p>
-          <w:p>
-            <w:pPr>
-              <w:spacing w:before="0" w:after="40" w:line="240" w:lineRule="auto"/>
-              <w:jc w:val="left"/>
-            </w:pPr>
-            <w:r>
-              <w:rPr>
-                <w:rFonts w:ascii="맑은 고딕" w:hAnsi="맑은 고딕" w:eastAsia="맑은 고딕"/>
-                <w:b w:val="0"/>
-                <w:color w:val="000000"/>
-                <w:sz w:val="20"/>
-              </w:rPr>
-              <w:t>설치 후 python -m pytest -q, 이어서 python -m demo --memory ./.tmp/demo-memory.jsonl "질문"으로 실행한다. 실제 memory/memory.jsonl 대신 격리 로그를 쓰면 원본 기억을 건드리지 않고 Node1~4 이벤트와 최종 답변을 재현할 수 있다. 2026-07-30 작업 트리에서 230 passed, 1 skipped를 확인했고, wheel 새 가상환경 설치 뒤 10개 fixture 재생도 통과했다.</w:t>
-            </w:r>
-          </w:p>
-          <w:p>
-            <w:pPr>
-              <w:spacing w:before="0" w:after="40" w:line="240" w:lineRule="auto"/>
-              <w:jc w:val="left"/>
-            </w:pPr>
-            <w:r>
-              <w:rPr>
-                <w:rFonts w:ascii="맑은 고딕" w:hAnsi="맑은 고딕" w:eastAsia="맑은 고딕"/>
-                <w:b/>
-                <w:color w:val="000000"/>
-                <w:sz w:val="20"/>
-              </w:rPr>
-              <w:t>평가 경계</w:t>
-            </w:r>
-          </w:p>
-          <w:p>
-            <w:pPr>
-              <w:spacing w:before="0" w:after="40" w:line="240" w:lineRule="auto"/>
-              <w:jc w:val="left"/>
-            </w:pPr>
-            <w:r>
-              <w:rPr>
-                <w:rFonts w:ascii="맑은 고딕" w:hAnsi="맑은 고딕" w:eastAsia="맑은 고딕"/>
-                <w:b w:val="0"/>
-                <w:color w:val="000000"/>
-                <w:sz w:val="20"/>
-              </w:rPr>
-              <w:t>python -m evals의 10개 합성 fixture는 평가기 계약과 해시·완전행렬 검증용이며 실제 모델 성능 수치가 아니다. 동일 qwen3:14b로 10 case×3구조 원시 파일럿 30건과 실패 1건을 모두 보존했지만 사람 정규화 전이므로 성능 수치로 인용하지 않는다. 라이브 비교는 동일 조건의 원문을 보존하고 review_status=reviewed인 결과만 인용한다.</w:t>
+              <w:spacing w:before="0" w:after="20" w:line="240" w:lineRule="auto"/>
+              <w:jc w:val="left"/>
+            </w:pPr>
+            <w:r>
+              <w:rPr>
+                <w:rFonts w:ascii="맑은 고딕" w:hAnsi="맑은 고딕" w:eastAsia="맑은 고딕"/>
+                <w:b w:val="0"/>
+                <w:sz w:val="18"/>
+              </w:rPr>
+              <w:t>1) append-only JSONL에 A/R 원자와 노드·도구 동선을 기록한다. 2) 모델이 고른 도구 원문 구간은 코드가 exact copy한다. 3) 경로 이탈·심볼릭 링크 이탈·비 Python 파일·크기 초과를 거부한다. 4) Node2의 증거 충분성 검사와 Node4의 답변 근거 검열을 분리한다.</w:t>
+            </w:r>
+          </w:p>
+          <w:p>
+            <w:pPr>
+              <w:spacing w:before="40" w:after="0" w:line="240" w:lineRule="auto"/>
+              <w:jc w:val="left"/>
+            </w:pPr>
+            <w:r>
+              <w:rPr>
+                <w:rFonts w:ascii="맑은 고딕" w:hAnsi="맑은 고딕" w:eastAsia="맑은 고딕"/>
+                <w:b/>
+                <w:sz w:val="18"/>
+              </w:rPr>
+              <w:t>코드 검증</w:t>
+            </w:r>
+          </w:p>
+          <w:p>
+            <w:pPr>
+              <w:spacing w:before="0" w:after="20" w:line="240" w:lineRule="auto"/>
+              <w:jc w:val="left"/>
+            </w:pPr>
+            <w:r>
+              <w:rPr>
+                <w:rFonts w:ascii="맑은 고딕" w:hAnsi="맑은 고딕" w:eastAsia="맑은 고딕"/>
+                <w:b w:val="0"/>
+                <w:sz w:val="18"/>
+              </w:rPr>
+              <w:t>공개 결과 커밋 33c9453을 GitHub에서 새 폴더로 clone하고 새 가상환경에 설치해 276 passed, 2 skipped를 재현했다. 두 skip은 Windows 심볼릭 링크 생성 권한이 없는 환경의 경계 시험이다. demo 도움말·fixture 평가·공개 결과 검증·wheel 빌드와 새 환경 설치도 통과했다.</w:t>
+            </w:r>
+          </w:p>
+          <w:p>
+            <w:pPr>
+              <w:spacing w:before="40" w:after="0" w:line="240" w:lineRule="auto"/>
+              <w:jc w:val="left"/>
+            </w:pPr>
+            <w:r>
+              <w:rPr>
+                <w:rFonts w:ascii="맑은 고딕" w:hAnsi="맑은 고딕" w:eastAsia="맑은 고딕"/>
+                <w:b/>
+                <w:sz w:val="18"/>
+              </w:rPr>
+              <w:t>공식 v2 holdout</w:t>
+            </w:r>
+          </w:p>
+          <w:p>
+            <w:pPr>
+              <w:spacing w:before="0" w:after="20" w:line="240" w:lineRule="auto"/>
+              <w:jc w:val="left"/>
+            </w:pPr>
+            <w:r>
+              <w:rPr>
+                <w:rFonts w:ascii="맑은 고딕" w:hAnsi="맑은 고딕" w:eastAsia="맑은 고딕"/>
+                <w:b w:val="0"/>
+                <w:sz w:val="18"/>
+              </w:rPr>
+              <w:t>24개 합성 Python 사례 × 3개 구조 × 3개 seed = 216회. 단일 에이전트 71/72(1건 ModelResponseError로 미완료), Node4 제외 송련 72/72, 전체 송련 72/72. 세 구조의 unsupported→supported 기계 proxy는 0건이다.</w:t>
+            </w:r>
+          </w:p>
+          <w:p>
+            <w:pPr>
+              <w:spacing w:before="40" w:after="0" w:line="240" w:lineRule="auto"/>
+              <w:jc w:val="left"/>
+            </w:pPr>
+            <w:r>
+              <w:rPr>
+                <w:rFonts w:ascii="맑은 고딕" w:hAnsi="맑은 고딕" w:eastAsia="맑은 고딕"/>
+                <w:b/>
+                <w:sz w:val="18"/>
+              </w:rPr>
+              <w:t>평가 무결성과 경계</w:t>
+            </w:r>
+          </w:p>
+          <w:p>
+            <w:pPr>
+              <w:spacing w:before="0" w:after="20" w:line="240" w:lineRule="auto"/>
+              <w:jc w:val="left"/>
+            </w:pPr>
+            <w:r>
+              <w:rPr>
+                <w:rFonts w:ascii="맑은 고딕" w:hAnsi="맑은 고딕" w:eastAsia="맑은 고딕"/>
+                <w:b w:val="0"/>
+                <w:sz w:val="18"/>
+              </w:rPr>
+              <w:t>첫 출력 전 소스·case·채점 규칙과 HMAC commitment를 동결했다. 첫 실행의 채점기 결함은 무효화하고, 같은 case·같은 SUT를 교정한 프로토콜로 재실행했다. v2 정제 결과의 공개 해시 검증은 통과했지만 필수 19개 사람 설명 감사 전 publishable=false다. 두 송련 구조가 동률이므로 Node4 효과·환각 제거·통계적 유의성·업무 일반화를 주장하지 않는다.</w:t>
             </w:r>
           </w:p>
         </w:tc>
@@ -1775,62 +1760,86 @@
           </w:tcPr>
           <w:p>
             <w:pPr>
-              <w:spacing w:before="0" w:after="40" w:line="240" w:lineRule="auto"/>
-              <w:jc w:val="left"/>
-            </w:pPr>
-            <w:r>
-              <w:rPr>
-                <w:rFonts w:ascii="맑은 고딕" w:hAnsi="맑은 고딕" w:eastAsia="맑은 고딕"/>
-                <w:b/>
-                <w:color w:val="000000"/>
-                <w:sz w:val="20"/>
+              <w:spacing w:before="0" w:after="0" w:line="240" w:lineRule="auto"/>
+              <w:jc w:val="left"/>
+            </w:pPr>
+            <w:r>
+              <w:rPr>
+                <w:rFonts w:ascii="맑은 고딕" w:hAnsi="맑은 고딕" w:eastAsia="맑은 고딕"/>
+                <w:b/>
+                <w:sz w:val="19"/>
               </w:rPr>
               <w:t>기대 효과</w:t>
             </w:r>
           </w:p>
           <w:p>
             <w:pPr>
-              <w:spacing w:before="0" w:after="40" w:line="240" w:lineRule="auto"/>
-              <w:jc w:val="left"/>
-            </w:pPr>
-            <w:r>
-              <w:rPr>
-                <w:rFonts w:ascii="맑은 고딕" w:hAnsi="맑은 고딕" w:eastAsia="맑은 고딕"/>
-                <w:b w:val="0"/>
-                <w:color w:val="000000"/>
-                <w:sz w:val="20"/>
-              </w:rPr>
-              <w:t>코드 조사·리뷰형 에이전트에서 ‘실제로 무엇을 읽고 실행했는가’와 ‘모델이 무엇을 판단했는가’를 다시 추적할 수 있다. 원본 감사 로그와 제한된 모델 시야를 분리해 출처 보존과 문맥 비용을 함께 다루는 기반을 제공한다.</w:t>
-            </w:r>
-          </w:p>
-          <w:p>
-            <w:pPr>
-              <w:spacing w:before="0" w:after="40" w:line="240" w:lineRule="auto"/>
-              <w:jc w:val="left"/>
-            </w:pPr>
-            <w:r>
-              <w:rPr>
-                <w:rFonts w:ascii="맑은 고딕" w:hAnsi="맑은 고딕" w:eastAsia="맑은 고딕"/>
-                <w:b/>
-                <w:color w:val="000000"/>
-                <w:sz w:val="20"/>
+              <w:spacing w:before="0" w:after="20" w:line="240" w:lineRule="auto"/>
+              <w:jc w:val="left"/>
+            </w:pPr>
+            <w:r>
+              <w:rPr>
+                <w:rFonts w:ascii="맑은 고딕" w:hAnsi="맑은 고딕" w:eastAsia="맑은 고딕"/>
+                <w:b w:val="0"/>
+                <w:sz w:val="19"/>
+              </w:rPr>
+              <w:t>코드 조사·리뷰형 에이전트에서 실제로 읽은 A와 모델이 판단한 R을 분리해 출처와 실행 동선을 다시 추적할 수 있다. 실패도 같은 형식으로 남겨 재현·감사·개선 대상을 좁힌다.</w:t>
+            </w:r>
+          </w:p>
+          <w:p>
+            <w:pPr>
+              <w:spacing w:before="40" w:after="0" w:line="240" w:lineRule="auto"/>
+              <w:jc w:val="left"/>
+            </w:pPr>
+            <w:r>
+              <w:rPr>
+                <w:rFonts w:ascii="맑은 고딕" w:hAnsi="맑은 고딕" w:eastAsia="맑은 고딕"/>
+                <w:b/>
+                <w:sz w:val="19"/>
+              </w:rPr>
+              <w:t>이번 실험이 준 설계 판단</w:t>
+            </w:r>
+          </w:p>
+          <w:p>
+            <w:pPr>
+              <w:spacing w:before="0" w:after="20" w:line="240" w:lineRule="auto"/>
+              <w:jc w:val="left"/>
+            </w:pPr>
+            <w:r>
+              <w:rPr>
+                <w:rFonts w:ascii="맑은 고딕" w:hAnsi="맑은 고딕" w:eastAsia="맑은 고딕"/>
+                <w:b w:val="0"/>
+                <w:sz w:val="19"/>
+              </w:rPr>
+              <w:t>전체 송련과 Node4 제외 구조의 독립 end-to-end verdict가 72쌍 모두 같았다. 따라서 이 쉬운 합성 집합에서는 Node4 상시 호출의 추가 이득을 확인하지 못했다. 다음에는 더 어려운 경계 사례와 선택적 Node4 정책의 비용 대비 효과를 측정한다.</w:t>
+            </w:r>
+          </w:p>
+          <w:p>
+            <w:pPr>
+              <w:spacing w:before="40" w:after="0" w:line="240" w:lineRule="auto"/>
+              <w:jc w:val="left"/>
+            </w:pPr>
+            <w:r>
+              <w:rPr>
+                <w:rFonts w:ascii="맑은 고딕" w:hAnsi="맑은 고딕" w:eastAsia="맑은 고딕"/>
+                <w:b/>
+                <w:sz w:val="19"/>
               </w:rPr>
               <w:t>활용·확장</w:t>
             </w:r>
           </w:p>
           <w:p>
             <w:pPr>
-              <w:spacing w:before="0" w:after="40" w:line="240" w:lineRule="auto"/>
-              <w:jc w:val="left"/>
-            </w:pPr>
-            <w:r>
-              <w:rPr>
-                <w:rFonts w:ascii="맑은 고딕" w:hAnsi="맑은 고딕" w:eastAsia="맑은 고딕"/>
-                <w:b w:val="0"/>
-                <w:color w:val="000000"/>
-                <w:sz w:val="20"/>
-              </w:rPr>
-              <w:t>읽기 전용 코드 조사, 내부 문서 검토, 실행 동선 감사에 적용할 수 있다. 이후 지식 DB·과거 기억 검색, 원본 불변 파생 압축, 추가 읽기 도구를 같은 A/R 계약 아래 확장할 수 있다.</w:t>
+              <w:spacing w:before="0" w:after="20" w:line="240" w:lineRule="auto"/>
+              <w:jc w:val="left"/>
+            </w:pPr>
+            <w:r>
+              <w:rPr>
+                <w:rFonts w:ascii="맑은 고딕" w:hAnsi="맑은 고딕" w:eastAsia="맑은 고딕"/>
+                <w:b w:val="0"/>
+                <w:sz w:val="19"/>
+              </w:rPr>
+              <w:t>읽기 전용 코드 조사와 내부 문서 감사에 적용하고, 이후 지식 DB·과거 기억 검색과 원본 보존형 파생 시야 압축을 같은 A/R 계약 아래 확장한다.</w:t>
             </w:r>
           </w:p>
         </w:tc>
@@ -1895,122 +1904,114 @@
           </w:tcPr>
           <w:p>
             <w:pPr>
-              <w:spacing w:before="0" w:after="40" w:line="240" w:lineRule="auto"/>
-              <w:jc w:val="left"/>
-            </w:pPr>
-            <w:r>
-              <w:rPr>
-                <w:rFonts w:ascii="맑은 고딕" w:hAnsi="맑은 고딕" w:eastAsia="맑은 고딕"/>
-                <w:b/>
-                <w:color w:val="000000"/>
-                <w:sz w:val="20"/>
+              <w:spacing w:before="0" w:after="0" w:line="240" w:lineRule="auto"/>
+              <w:jc w:val="left"/>
+            </w:pPr>
+            <w:r>
+              <w:rPr>
+                <w:rFonts w:ascii="맑은 고딕" w:hAnsi="맑은 고딕" w:eastAsia="맑은 고딕"/>
+                <w:b/>
+                <w:sz w:val="18"/>
               </w:rPr>
               <w:t>차별성</w:t>
             </w:r>
           </w:p>
           <w:p>
             <w:pPr>
-              <w:spacing w:before="0" w:after="40" w:line="240" w:lineRule="auto"/>
-              <w:jc w:val="left"/>
-            </w:pPr>
-            <w:r>
-              <w:rPr>
-                <w:rFonts w:ascii="맑은 고딕" w:hAnsi="맑은 고딕" w:eastAsia="맑은 고딕"/>
-                <w:b w:val="0"/>
-                <w:color w:val="000000"/>
-                <w:sz w:val="20"/>
-              </w:rPr>
-              <w:t>더 큰 프롬프트 하나에 신뢰를 맡기지 않는다. 모델 출력은 끝까지 R로 유지하고, 도구 원문·카운터·라우팅은 코드가 A로 기록한다. 증거를 고르는 Node1, 충분성을 보는 Node2, 답하는 Node3, 근거를 검열하는 Node4를 분리하며 반려 상한 초과도 성공으로 위장하지 않는다.</w:t>
-            </w:r>
-          </w:p>
-          <w:p>
-            <w:pPr>
-              <w:spacing w:before="0" w:after="40" w:line="240" w:lineRule="auto"/>
-              <w:jc w:val="left"/>
-            </w:pPr>
-            <w:r>
-              <w:rPr>
-                <w:rFonts w:ascii="맑은 고딕" w:hAnsi="맑은 고딕" w:eastAsia="맑은 고딕"/>
-                <w:b/>
-                <w:color w:val="000000"/>
-                <w:sz w:val="20"/>
+              <w:spacing w:before="0" w:after="20" w:line="240" w:lineRule="auto"/>
+              <w:jc w:val="left"/>
+            </w:pPr>
+            <w:r>
+              <w:rPr>
+                <w:rFonts w:ascii="맑은 고딕" w:hAnsi="맑은 고딕" w:eastAsia="맑은 고딕"/>
+                <w:b w:val="0"/>
+                <w:sz w:val="18"/>
+              </w:rPr>
+              <w:t>더 큰 프롬프트 하나에 신뢰를 맡기지 않는다. 모델 출력은 R로 유지하고, 도구 원문·카운터·라우팅은 코드가 A로 기록한다. 반려 한도 초과도 성공으로 위장하지 않고 검증 미완료로 표시한다.</w:t>
+            </w:r>
+          </w:p>
+          <w:p>
+            <w:pPr>
+              <w:spacing w:before="40" w:after="0" w:line="240" w:lineRule="auto"/>
+              <w:jc w:val="left"/>
+            </w:pPr>
+            <w:r>
+              <w:rPr>
+                <w:rFonts w:ascii="맑은 고딕" w:hAnsi="맑은 고딕" w:eastAsia="맑은 고딕"/>
+                <w:b/>
+                <w:sz w:val="18"/>
               </w:rPr>
               <w:t>현재 한계</w:t>
             </w:r>
           </w:p>
           <w:p>
             <w:pPr>
-              <w:spacing w:before="0" w:after="40" w:line="240" w:lineRule="auto"/>
-              <w:jc w:val="left"/>
-            </w:pPr>
-            <w:r>
-              <w:rPr>
-                <w:rFonts w:ascii="맑은 고딕" w:hAnsi="맑은 고딕" w:eastAsia="맑은 고딕"/>
-                <w:b w:val="0"/>
-                <w:color w:val="000000"/>
-                <w:sz w:val="20"/>
-              </w:rPr>
-              <w:t>데모 도구는 .py 목록·열람에 집중한다. 지식 색인은 아직 Node1 검색 도구와 연결되지 않았고 과거 기억 검색·압축도 없다. 모델 판단은 R이므로 오류가 남을 수 있고, 반려 상한 초과 답변은 반환되더라도 검증 미완료다.</w:t>
-            </w:r>
-          </w:p>
-          <w:p>
-            <w:pPr>
-              <w:spacing w:before="0" w:after="40" w:line="240" w:lineRule="auto"/>
-              <w:jc w:val="left"/>
-            </w:pPr>
-            <w:r>
-              <w:rPr>
-                <w:rFonts w:ascii="맑은 고딕" w:hAnsi="맑은 고딕" w:eastAsia="맑은 고딕"/>
-                <w:b/>
-                <w:color w:val="000000"/>
-                <w:sz w:val="20"/>
-              </w:rPr>
-              <w:t>로드맵</w:t>
-            </w:r>
-          </w:p>
-          <w:p>
-            <w:pPr>
-              <w:spacing w:before="0" w:after="40" w:line="240" w:lineRule="auto"/>
-              <w:jc w:val="left"/>
-            </w:pPr>
-            <w:r>
-              <w:rPr>
-                <w:rFonts w:ascii="맑은 고딕" w:hAnsi="맑은 고딕" w:eastAsia="맑은 고딕"/>
-                <w:b w:val="0"/>
-                <w:color w:val="000000"/>
-                <w:sz w:val="20"/>
-              </w:rPr>
-              <w:t>동일 모델 3개 구조 변형의 공개 비교평가 → 지식·기억 검색 도구 → 원본 보존형 파생 시야 압축 → 다중 writer 잠금과 장기 실행 관측 순으로 확장한다.</w:t>
-            </w:r>
-          </w:p>
-          <w:p>
-            <w:pPr>
-              <w:spacing w:before="0" w:after="40" w:line="240" w:lineRule="auto"/>
-              <w:jc w:val="left"/>
-            </w:pPr>
-            <w:r>
-              <w:rPr>
-                <w:rFonts w:ascii="맑은 고딕" w:hAnsi="맑은 고딕" w:eastAsia="맑은 고딕"/>
-                <w:b/>
-                <w:color w:val="000000"/>
-                <w:sz w:val="20"/>
+              <w:spacing w:before="0" w:after="20" w:line="240" w:lineRule="auto"/>
+              <w:jc w:val="left"/>
+            </w:pPr>
+            <w:r>
+              <w:rPr>
+                <w:rFonts w:ascii="맑은 고딕" w:hAnsi="맑은 고딕" w:eastAsia="맑은 고딕"/>
+                <w:b w:val="0"/>
+                <w:sz w:val="18"/>
+              </w:rPr>
+              <w:t>도구는 .py 목록·열람에 집중하며 기억 검색·압축은 없다. v2는 첫 verdict만 기계 채점했고 19개 감사는 216개 전체 설명 검증이 아니다. 공개 verifier는 정제 결과의 해시 정합성을 검사하지만 private raw 재생과 lock/reveal의 별도 공개 시점은 입증하지 못한다. 다음 실험은 두 공개 커밋을 분리한다.</w:t>
+            </w:r>
+          </w:p>
+          <w:p>
+            <w:pPr>
+              <w:spacing w:before="40" w:after="0" w:line="240" w:lineRule="auto"/>
+              <w:jc w:val="left"/>
+            </w:pPr>
+            <w:r>
+              <w:rPr>
+                <w:rFonts w:ascii="맑은 고딕" w:hAnsi="맑은 고딕" w:eastAsia="맑은 고딕"/>
+                <w:b/>
+                <w:sz w:val="18"/>
+              </w:rPr>
+              <w:t>재현 기준</w:t>
+            </w:r>
+          </w:p>
+          <w:p>
+            <w:pPr>
+              <w:spacing w:before="0" w:after="20" w:line="240" w:lineRule="auto"/>
+              <w:jc w:val="left"/>
+            </w:pPr>
+            <w:r>
+              <w:rPr>
+                <w:rFonts w:ascii="맑은 고딕" w:hAnsi="맑은 고딕" w:eastAsia="맑은 고딕"/>
+                <w:b w:val="0"/>
+                <w:sz w:val="18"/>
+              </w:rPr>
+              <w:t>실험 소스 동결 8e37b4c303081afcfa23ec0ef730e02b2f27ffa6, 공개 결과 체인 33c94534c168fb015b85984832503a6de5f170c6. 제출 최종 SHA·영상 URL·신원 정보는 동결 뒤 입력한다.</w:t>
+            </w:r>
+          </w:p>
+          <w:p>
+            <w:pPr>
+              <w:spacing w:before="40" w:after="0" w:line="240" w:lineRule="auto"/>
+              <w:jc w:val="left"/>
+            </w:pPr>
+            <w:r>
+              <w:rPr>
+                <w:rFonts w:ascii="맑은 고딕" w:hAnsi="맑은 고딕" w:eastAsia="맑은 고딕"/>
+                <w:b/>
+                <w:sz w:val="18"/>
               </w:rPr>
               <w:t>개발 소감</w:t>
             </w:r>
           </w:p>
           <w:p>
             <w:pPr>
-              <w:spacing w:before="0" w:after="40" w:line="240" w:lineRule="auto"/>
-              <w:jc w:val="left"/>
-            </w:pPr>
-            <w:r>
-              <w:rPr>
-                <w:rFonts w:ascii="맑은 고딕" w:hAnsi="맑은 고딕" w:eastAsia="맑은 고딕"/>
-                <w:b w:val="0"/>
-                <w:color w:val="000000"/>
-                <w:sz w:val="20"/>
-              </w:rPr>
-              <w:t>[참가자가 직접 작성 필요: 문제 정의, A/R 분리를 구현하며 겪은 시행착오, 실제 데모와 테스트에서 배운 점을 본인의 경험으로 3~5문장 기재]</w:t>
+              <w:spacing w:before="0" w:after="20" w:line="240" w:lineRule="auto"/>
+              <w:jc w:val="left"/>
+            </w:pPr>
+            <w:r>
+              <w:rPr>
+                <w:rFonts w:ascii="맑은 고딕" w:hAnsi="맑은 고딕" w:eastAsia="맑은 고딕"/>
+                <w:b w:val="0"/>
+                <w:sz w:val="18"/>
+              </w:rPr>
+              <w:t>[참가자가 직접 작성: 문제 정의, A/R 분리를 구현하며 겪은 시행착오, 실제 데모와 테스트에서 배운 점을 본인의 경험으로 3~5문장 기재]</w:t>
             </w:r>
           </w:p>
         </w:tc>
@@ -2898,17 +2899,16 @@
           </w:tcPr>
           <w:p>
             <w:pPr>
-              <w:spacing w:before="0" w:after="40" w:line="240" w:lineRule="auto"/>
-              <w:jc w:val="center"/>
-            </w:pPr>
-            <w:r>
-              <w:rPr>
-                <w:rFonts w:ascii="맑은 고딕" w:hAnsi="맑은 고딕" w:eastAsia="맑은 고딕"/>
-                <w:b w:val="0"/>
-                <w:color w:val="000000"/>
-                <w:sz w:val="20"/>
-              </w:rPr>
-              <w:t>9.0.3</w:t>
+              <w:spacing w:before="0" w:after="0" w:line="240" w:lineRule="auto"/>
+              <w:jc w:val="left"/>
+            </w:pPr>
+            <w:r>
+              <w:rPr>
+                <w:rFonts w:ascii="맑은 고딕" w:hAnsi="맑은 고딕" w:eastAsia="맑은 고딕"/>
+                <w:b w:val="0"/>
+                <w:sz w:val="16"/>
+              </w:rPr>
+              <w:t>9.1.1</w:t>
             </w:r>
           </w:p>
         </w:tc>
@@ -3621,17 +3621,16 @@
           </w:tcPr>
           <w:p>
             <w:pPr>
-              <w:spacing w:before="0" w:after="40" w:line="240" w:lineRule="auto"/>
-              <w:jc w:val="left"/>
-            </w:pPr>
-            <w:r>
-              <w:rPr>
-                <w:rFonts w:ascii="맑은 고딕" w:hAnsi="맑은 고딕" w:eastAsia="맑은 고딕"/>
-                <w:b w:val="0"/>
-                <w:color w:val="000000"/>
-                <w:sz w:val="20"/>
-              </w:rPr>
-              <w:t>로컬 비교평가 기준선(자동 fallback 아님)</w:t>
+              <w:spacing w:before="0" w:after="0" w:line="240" w:lineRule="auto"/>
+              <w:jc w:val="left"/>
+            </w:pPr>
+            <w:r>
+              <w:rPr>
+                <w:rFonts w:ascii="맑은 고딕" w:hAnsi="맑은 고딕" w:eastAsia="맑은 고딕"/>
+                <w:b w:val="0"/>
+                <w:sz w:val="16"/>
+              </w:rPr>
+              <w:t>과거 로컬 탐색 기준선(공식 v2 비교군·fallback 아님)</w:t>
             </w:r>
           </w:p>
         </w:tc>
@@ -4593,17 +4592,16 @@
           </w:tcPr>
           <w:p>
             <w:pPr>
-              <w:spacing w:before="0" w:after="40" w:line="240" w:lineRule="auto"/>
-              <w:jc w:val="left"/>
-            </w:pPr>
-            <w:r>
-              <w:rPr>
-                <w:rFonts w:ascii="맑은 고딕" w:hAnsi="맑은 고딕" w:eastAsia="맑은 고딕"/>
-                <w:b w:val="0"/>
-                <w:color w:val="000000"/>
-                <w:sz w:val="20"/>
-              </w:rPr>
-              <w:t>https://github.com/Junghoo-developer/SongRyeon/tree/refoundation/songryeon-v1</w:t>
+              <w:spacing w:before="0" w:after="0" w:line="240" w:lineRule="auto"/>
+              <w:jc w:val="left"/>
+            </w:pPr>
+            <w:r>
+              <w:rPr>
+                <w:rFonts w:ascii="맑은 고딕" w:hAnsi="맑은 고딕" w:eastAsia="맑은 고딕"/>
+                <w:b w:val="0"/>
+                <w:sz w:val="17"/>
+              </w:rPr>
+              <w:t>https://github.com/Junghoo-developer/SongRyeon/tree/codex/contest-release-2026</w:t>
             </w:r>
           </w:p>
         </w:tc>
@@ -4640,17 +4638,16 @@
           </w:tcPr>
           <w:p>
             <w:pPr>
-              <w:spacing w:before="0" w:after="40" w:line="240" w:lineRule="auto"/>
-              <w:jc w:val="left"/>
-            </w:pPr>
-            <w:r>
-              <w:rPr>
-                <w:rFonts w:ascii="맑은 고딕" w:hAnsi="맑은 고딕" w:eastAsia="맑은 고딕"/>
-                <w:b w:val="0"/>
-                <w:color w:val="000000"/>
-                <w:sz w:val="20"/>
-              </w:rPr>
-              <w:t>OpenAI Codex를 설계 토론, 코드 초안·수정, 테스트 작성·실행, 문서 검토 보조에 사용했다. 참가자가 목표와 구조를 결정하고 실제 데모 출력·프롬프트·테스트 결과를 반복 확인해 제안을 수정·채택했다. AI 보조가 만든 일부 코드·문서 초안은 사람의 검토와 회귀 테스트를 거쳐 출품 소스에 포함되었다. 사용 비율은 임의로 산정하지 않았다.</w:t>
+              <w:spacing w:before="0" w:after="0" w:line="240" w:lineRule="auto"/>
+              <w:jc w:val="left"/>
+            </w:pPr>
+            <w:r>
+              <w:rPr>
+                <w:rFonts w:ascii="맑은 고딕" w:hAnsi="맑은 고딕" w:eastAsia="맑은 고딕"/>
+                <w:b w:val="0"/>
+                <w:sz w:val="17"/>
+              </w:rPr>
+              <w:t>OpenAI Codex가 구조·프롬프트 토론, 코드·테스트·평가 도구·문서의 작성과 실행을 광범위하게 수행했다. 참가자는 문제와 A/R 철학, 노드 역할, 실험 질문을 정하고 실제 모델 출력·프롬프트·주요 코드 흐름을 반복 검수해 변경 채택과 최종 제출 주장을 직접 승인한다. 일부 생성 코드는 회귀 테스트 뒤 출품 소스에 포함됐다.</w:t>
             </w:r>
           </w:p>
         </w:tc>

</xml_diff>

<commit_message>
release: publish audited contest evidence
</commit_message>
<xml_diff>
--- a/submission/2026 오픈소스 개발자대회 결과보고서_접수번호(팀명)_DRAFT.docx
+++ b/submission/2026 오픈소스 개발자대회 결과보고서_접수번호(팀명)_DRAFT.docx
@@ -1675,7 +1675,7 @@
                 <w:b w:val="0"/>
                 <w:sz w:val="18"/>
               </w:rPr>
-              <w:t>첫 출력 전 소스·case·채점 규칙과 HMAC commitment를 동결했다. 첫 실행의 채점기 결함은 무효화하고, 같은 case·같은 SUT를 교정한 프로토콜로 재실행했다. v2 정제 결과의 공개 해시 검증은 통과했지만 필수 19개 사람 설명 감사 전 publishable=false다. 두 송련 구조가 동률이므로 Node4 효과·환각 제거·통계적 유의성·업무 일반화를 주장하지 않는다.</w:t>
+              <w:t>첫 출력 전 소스·case·채점 규칙과 HMAC commitment를 동결했다. 첫 실행의 채점기 결함은 무효화하고, 같은 case·같은 SUT를 교정한 프로토콜로 재실행했다. 공개 해시 검증과 필수 blind 19개 사람 감사 뒤 publication integrity gate를 통과했다. 감사 결과는 parse 19/19, fixture 근거성과 A/R 권한·출처 표기 각각 18/19였고 나머지는 null 미완료였다. 이는 성능 우월성·Node4 효과·216개 설명 전체·통계적 유의성·업무 일반화·환각 제거를 입증하지 않는다.</w:t>
             </w:r>
           </w:p>
         </w:tc>
@@ -1955,7 +1955,7 @@
                 <w:b w:val="0"/>
                 <w:sz w:val="18"/>
               </w:rPr>
-              <w:t>도구는 .py 목록·열람에 집중하며 기억 검색·압축은 없다. v2는 첫 verdict만 기계 채점했고 19개 감사는 216개 전체 설명 검증이 아니다. 공개 verifier는 정제 결과의 해시 정합성을 검사하지만 private raw 재생과 lock/reveal의 별도 공개 시점은 입증하지 못한다. 다음 실험은 두 공개 커밋을 분리한다.</w:t>
+              <w:t>도구는 .py 목록·열람에 집중하며 기억 검색·압축은 없다. v2는 첫 verdict만 기계 채점했고 사람 감사는 필수 19개에 한정돼 216개 전체 설명 검증이 아니다. 미완료 1건은 boolean 스키마에서 N/A 대신 false로 기록됐다. 공개 verifier는 정제 결과의 해시 정합성을 검사하지만 private raw 재생과 lock/reveal의 별도 공개 시점은 입증하지 못한다.</w:t>
             </w:r>
           </w:p>
           <w:p>

</xml_diff>